<commit_message>
Standardize manuscript formula notation and rendering
</commit_message>
<xml_diff>
--- a/submission_documents/Additional_file_1_supplementary_methods.docx
+++ b/submission_documents/Additional_file_1_supplementary_methods.docx
@@ -9739,7 +9739,21 @@
                 <w:rFonts w:ascii="Cambria Math" w:hAnsi="Cambria Math"/>
                 <w:sz w:val="22"/>
               </w:rPr>
-              <m:t>best,u</m:t>
+              <m:t>best</m:t>
+            </m:r>
+            <m:r>
+              <w:rPr>
+                <w:rFonts w:ascii="Cambria Math" w:hAnsi="Cambria Math"/>
+                <w:sz w:val="22"/>
+              </w:rPr>
+              <m:t>,</m:t>
+            </m:r>
+            <m:r>
+              <w:rPr>
+                <w:rFonts w:ascii="Cambria Math" w:hAnsi="Cambria Math"/>
+                <w:sz w:val="22"/>
+              </w:rPr>
+              <m:t>u</m:t>
             </m:r>
           </m:sub>
         </m:sSub>
@@ -9870,7 +9884,21 @@
                 <w:rFonts w:ascii="Cambria Math" w:hAnsi="Cambria Math"/>
                 <w:sz w:val="22"/>
               </w:rPr>
-              <m:t>best,u</m:t>
+              <m:t>best</m:t>
+            </m:r>
+            <m:r>
+              <w:rPr>
+                <w:rFonts w:ascii="Cambria Math" w:hAnsi="Cambria Math"/>
+                <w:sz w:val="22"/>
+              </w:rPr>
+              <m:t>,</m:t>
+            </m:r>
+            <m:r>
+              <w:rPr>
+                <w:rFonts w:ascii="Cambria Math" w:hAnsi="Cambria Math"/>
+                <w:sz w:val="22"/>
+              </w:rPr>
+              <m:t>u</m:t>
             </m:r>
           </m:sub>
         </m:sSub>
@@ -10186,7 +10214,21 @@
                 <w:rFonts w:ascii="Cambria Math" w:hAnsi="Cambria Math"/>
                 <w:sz w:val="22"/>
               </w:rPr>
-              <m:t>q,u</m:t>
+              <m:t>q</m:t>
+            </m:r>
+            <m:r>
+              <w:rPr>
+                <w:rFonts w:ascii="Cambria Math" w:hAnsi="Cambria Math"/>
+                <w:sz w:val="22"/>
+              </w:rPr>
+              <m:t>,</m:t>
+            </m:r>
+            <m:r>
+              <w:rPr>
+                <w:rFonts w:ascii="Cambria Math" w:hAnsi="Cambria Math"/>
+                <w:sz w:val="22"/>
+              </w:rPr>
+              <m:t>u</m:t>
             </m:r>
           </m:sub>
         </m:sSub>
@@ -12135,7 +12177,10 @@
       <m:oMath>
         <m:sSub>
           <m:e>
-            <m:sSub>
+            <m:acc>
+              <m:accPr>
+                <m:chr m:val="¯"/>
+              </m:accPr>
               <m:e>
                 <m:r>
                   <w:rPr>
@@ -12145,27 +12190,46 @@
                   <m:t>G</m:t>
                 </m:r>
               </m:e>
-              <m:sub>
-                <m:r>
-                  <m:rPr>
-                    <m:sty m:val="p"/>
-                  </m:rPr>
-                  <w:rPr>
-                    <w:rFonts w:ascii="Cambria Math" w:hAnsi="Cambria Math"/>
-                    <w:sz w:val="22"/>
-                  </w:rPr>
-                  <m:t>inv</m:t>
-                </m:r>
-              </m:sub>
-            </m:sSub>
+            </m:acc>
           </m:e>
           <m:sub>
             <m:r>
+              <m:rPr>
+                <m:sty m:val="p"/>
+              </m:rPr>
               <w:rPr>
                 <w:rFonts w:ascii="Cambria Math" w:hAnsi="Cambria Math"/>
                 <w:sz w:val="22"/>
               </w:rPr>
-              <m:t>e,s</m:t>
+              <m:t>inv</m:t>
+            </m:r>
+            <m:r>
+              <w:rPr>
+                <w:rFonts w:ascii="Cambria Math" w:hAnsi="Cambria Math"/>
+                <w:sz w:val="22"/>
+              </w:rPr>
+              <m:t>,</m:t>
+            </m:r>
+            <m:r>
+              <w:rPr>
+                <w:rFonts w:ascii="Cambria Math" w:hAnsi="Cambria Math"/>
+                <w:sz w:val="22"/>
+              </w:rPr>
+              <m:t>e</m:t>
+            </m:r>
+            <m:r>
+              <w:rPr>
+                <w:rFonts w:ascii="Cambria Math" w:hAnsi="Cambria Math"/>
+                <w:sz w:val="22"/>
+              </w:rPr>
+              <m:t>,</m:t>
+            </m:r>
+            <m:r>
+              <w:rPr>
+                <w:rFonts w:ascii="Cambria Math" w:hAnsi="Cambria Math"/>
+                <w:sz w:val="22"/>
+              </w:rPr>
+              <m:t>s</m:t>
             </m:r>
           </m:sub>
         </m:sSub>
@@ -12349,7 +12413,10 @@
                   <m:e>
                     <m:sSub>
                       <m:e>
-                        <m:sSub>
+                        <m:acc>
+                          <m:accPr>
+                            <m:chr m:val="¯"/>
+                          </m:accPr>
                           <m:e>
                             <m:r>
                               <w:rPr>
@@ -12359,27 +12426,46 @@
                               <m:t>G</m:t>
                             </m:r>
                           </m:e>
-                          <m:sub>
-                            <m:r>
-                              <m:rPr>
-                                <m:sty m:val="p"/>
-                              </m:rPr>
-                              <w:rPr>
-                                <w:rFonts w:ascii="Cambria Math" w:hAnsi="Cambria Math"/>
-                                <w:sz w:val="22"/>
-                              </w:rPr>
-                              <m:t>inv</m:t>
-                            </m:r>
-                          </m:sub>
-                        </m:sSub>
+                        </m:acc>
                       </m:e>
                       <m:sub>
+                        <m:r>
+                          <m:rPr>
+                            <m:sty m:val="p"/>
+                          </m:rPr>
+                          <w:rPr>
+                            <w:rFonts w:ascii="Cambria Math" w:hAnsi="Cambria Math"/>
+                            <w:sz w:val="22"/>
+                          </w:rPr>
+                          <m:t>inv</m:t>
+                        </m:r>
                         <m:r>
                           <w:rPr>
                             <w:rFonts w:ascii="Cambria Math" w:hAnsi="Cambria Math"/>
                             <w:sz w:val="22"/>
                           </w:rPr>
-                          <m:t>e,s</m:t>
+                          <m:t>,</m:t>
+                        </m:r>
+                        <m:r>
+                          <w:rPr>
+                            <w:rFonts w:ascii="Cambria Math" w:hAnsi="Cambria Math"/>
+                            <w:sz w:val="22"/>
+                          </w:rPr>
+                          <m:t>e</m:t>
+                        </m:r>
+                        <m:r>
+                          <w:rPr>
+                            <w:rFonts w:ascii="Cambria Math" w:hAnsi="Cambria Math"/>
+                            <w:sz w:val="22"/>
+                          </w:rPr>
+                          <m:t>,</m:t>
+                        </m:r>
+                        <m:r>
+                          <w:rPr>
+                            <w:rFonts w:ascii="Cambria Math" w:hAnsi="Cambria Math"/>
+                            <w:sz w:val="22"/>
+                          </w:rPr>
+                          <m:t>s</m:t>
                         </m:r>
                       </m:sub>
                     </m:sSub>
@@ -12392,7 +12478,10 @@
                     </m:r>
                     <m:sSub>
                       <m:e>
-                        <m:sSub>
+                        <m:acc>
+                          <m:accPr>
+                            <m:chr m:val="¯"/>
+                          </m:accPr>
                           <m:e>
                             <m:r>
                               <w:rPr>
@@ -12402,27 +12491,46 @@
                               <m:t>G</m:t>
                             </m:r>
                           </m:e>
-                          <m:sub>
-                            <m:r>
-                              <m:rPr>
-                                <m:sty m:val="p"/>
-                              </m:rPr>
-                              <w:rPr>
-                                <w:rFonts w:ascii="Cambria Math" w:hAnsi="Cambria Math"/>
-                                <w:sz w:val="22"/>
-                              </w:rPr>
-                              <m:t>inv</m:t>
-                            </m:r>
-                          </m:sub>
-                        </m:sSub>
+                        </m:acc>
                       </m:e>
                       <m:sub>
+                        <m:r>
+                          <m:rPr>
+                            <m:sty m:val="p"/>
+                          </m:rPr>
+                          <w:rPr>
+                            <w:rFonts w:ascii="Cambria Math" w:hAnsi="Cambria Math"/>
+                            <w:sz w:val="22"/>
+                          </w:rPr>
+                          <m:t>inv</m:t>
+                        </m:r>
                         <m:r>
                           <w:rPr>
                             <w:rFonts w:ascii="Cambria Math" w:hAnsi="Cambria Math"/>
                             <w:sz w:val="22"/>
                           </w:rPr>
-                          <m:t>e,s</m:t>
+                          <m:t>,</m:t>
+                        </m:r>
+                        <m:r>
+                          <w:rPr>
+                            <w:rFonts w:ascii="Cambria Math" w:hAnsi="Cambria Math"/>
+                            <w:sz w:val="22"/>
+                          </w:rPr>
+                          <m:t>e</m:t>
+                        </m:r>
+                        <m:r>
+                          <w:rPr>
+                            <w:rFonts w:ascii="Cambria Math" w:hAnsi="Cambria Math"/>
+                            <w:sz w:val="22"/>
+                          </w:rPr>
+                          <m:t>,</m:t>
+                        </m:r>
+                        <m:r>
+                          <w:rPr>
+                            <w:rFonts w:ascii="Cambria Math" w:hAnsi="Cambria Math"/>
+                            <w:sz w:val="22"/>
+                          </w:rPr>
+                          <m:t>s</m:t>
                         </m:r>
                       </m:sub>
                     </m:sSub>
@@ -12608,7 +12716,35 @@
                 <w:rFonts w:ascii="Cambria Math" w:hAnsi="Cambria Math"/>
                 <w:sz w:val="22"/>
               </w:rPr>
-              <m:t>raw,u,j</m:t>
+              <m:t>raw</m:t>
+            </m:r>
+            <m:r>
+              <w:rPr>
+                <w:rFonts w:ascii="Cambria Math" w:hAnsi="Cambria Math"/>
+                <w:sz w:val="22"/>
+              </w:rPr>
+              <m:t>,</m:t>
+            </m:r>
+            <m:r>
+              <w:rPr>
+                <w:rFonts w:ascii="Cambria Math" w:hAnsi="Cambria Math"/>
+                <w:sz w:val="22"/>
+              </w:rPr>
+              <m:t>u</m:t>
+            </m:r>
+            <m:r>
+              <w:rPr>
+                <w:rFonts w:ascii="Cambria Math" w:hAnsi="Cambria Math"/>
+                <w:sz w:val="22"/>
+              </w:rPr>
+              <m:t>,</m:t>
+            </m:r>
+            <m:r>
+              <w:rPr>
+                <w:rFonts w:ascii="Cambria Math" w:hAnsi="Cambria Math"/>
+                <w:sz w:val="22"/>
+              </w:rPr>
+              <m:t>j</m:t>
             </m:r>
           </m:sub>
         </m:sSub>
@@ -12638,7 +12774,35 @@
                 <w:rFonts w:ascii="Cambria Math" w:hAnsi="Cambria Math"/>
                 <w:sz w:val="22"/>
               </w:rPr>
-              <m:t>ctr,u,j</m:t>
+              <m:t>ctr</m:t>
+            </m:r>
+            <m:r>
+              <w:rPr>
+                <w:rFonts w:ascii="Cambria Math" w:hAnsi="Cambria Math"/>
+                <w:sz w:val="22"/>
+              </w:rPr>
+              <m:t>,</m:t>
+            </m:r>
+            <m:r>
+              <w:rPr>
+                <w:rFonts w:ascii="Cambria Math" w:hAnsi="Cambria Math"/>
+                <w:sz w:val="22"/>
+              </w:rPr>
+              <m:t>u</m:t>
+            </m:r>
+            <m:r>
+              <w:rPr>
+                <w:rFonts w:ascii="Cambria Math" w:hAnsi="Cambria Math"/>
+                <w:sz w:val="22"/>
+              </w:rPr>
+              <m:t>,</m:t>
+            </m:r>
+            <m:r>
+              <w:rPr>
+                <w:rFonts w:ascii="Cambria Math" w:hAnsi="Cambria Math"/>
+                <w:sz w:val="22"/>
+              </w:rPr>
+              <m:t>j</m:t>
             </m:r>
           </m:sub>
         </m:sSub>
@@ -12738,7 +12902,35 @@
                 <w:rFonts w:ascii="Cambria Math" w:hAnsi="Cambria Math"/>
                 <w:sz w:val="22"/>
               </w:rPr>
-              <m:t>ref,u,j</m:t>
+              <m:t>ref</m:t>
+            </m:r>
+            <m:r>
+              <w:rPr>
+                <w:rFonts w:ascii="Cambria Math" w:hAnsi="Cambria Math"/>
+                <w:sz w:val="22"/>
+              </w:rPr>
+              <m:t>,</m:t>
+            </m:r>
+            <m:r>
+              <w:rPr>
+                <w:rFonts w:ascii="Cambria Math" w:hAnsi="Cambria Math"/>
+                <w:sz w:val="22"/>
+              </w:rPr>
+              <m:t>u</m:t>
+            </m:r>
+            <m:r>
+              <w:rPr>
+                <w:rFonts w:ascii="Cambria Math" w:hAnsi="Cambria Math"/>
+                <w:sz w:val="22"/>
+              </w:rPr>
+              <m:t>,</m:t>
+            </m:r>
+            <m:r>
+              <w:rPr>
+                <w:rFonts w:ascii="Cambria Math" w:hAnsi="Cambria Math"/>
+                <w:sz w:val="22"/>
+              </w:rPr>
+              <m:t>j</m:t>
             </m:r>
           </m:sub>
         </m:sSub>
@@ -12795,7 +12987,35 @@
                 <w:rFonts w:ascii="Cambria Math" w:hAnsi="Cambria Math"/>
                 <w:sz w:val="22"/>
               </w:rPr>
-              <m:t>rank,u,j</m:t>
+              <m:t>rank</m:t>
+            </m:r>
+            <m:r>
+              <w:rPr>
+                <w:rFonts w:ascii="Cambria Math" w:hAnsi="Cambria Math"/>
+                <w:sz w:val="22"/>
+              </w:rPr>
+              <m:t>,</m:t>
+            </m:r>
+            <m:r>
+              <w:rPr>
+                <w:rFonts w:ascii="Cambria Math" w:hAnsi="Cambria Math"/>
+                <w:sz w:val="22"/>
+              </w:rPr>
+              <m:t>u</m:t>
+            </m:r>
+            <m:r>
+              <w:rPr>
+                <w:rFonts w:ascii="Cambria Math" w:hAnsi="Cambria Math"/>
+                <w:sz w:val="22"/>
+              </w:rPr>
+              <m:t>,</m:t>
+            </m:r>
+            <m:r>
+              <w:rPr>
+                <w:rFonts w:ascii="Cambria Math" w:hAnsi="Cambria Math"/>
+                <w:sz w:val="22"/>
+              </w:rPr>
+              <m:t>j</m:t>
             </m:r>
           </m:sub>
         </m:sSub>
@@ -13542,7 +13762,49 @@
                 <w:rFonts w:ascii="Cambria Math" w:hAnsi="Cambria Math"/>
                 <w:sz w:val="22"/>
               </w:rPr>
-              <m:t>best,u,p,K</m:t>
+              <m:t>best</m:t>
+            </m:r>
+            <m:r>
+              <w:rPr>
+                <w:rFonts w:ascii="Cambria Math" w:hAnsi="Cambria Math"/>
+                <w:sz w:val="22"/>
+              </w:rPr>
+              <m:t>,</m:t>
+            </m:r>
+            <m:r>
+              <w:rPr>
+                <w:rFonts w:ascii="Cambria Math" w:hAnsi="Cambria Math"/>
+                <w:sz w:val="22"/>
+              </w:rPr>
+              <m:t>u</m:t>
+            </m:r>
+            <m:r>
+              <w:rPr>
+                <w:rFonts w:ascii="Cambria Math" w:hAnsi="Cambria Math"/>
+                <w:sz w:val="22"/>
+              </w:rPr>
+              <m:t>,</m:t>
+            </m:r>
+            <m:r>
+              <w:rPr>
+                <w:rFonts w:ascii="Cambria Math" w:hAnsi="Cambria Math"/>
+                <w:sz w:val="22"/>
+              </w:rPr>
+              <m:t>p</m:t>
+            </m:r>
+            <m:r>
+              <w:rPr>
+                <w:rFonts w:ascii="Cambria Math" w:hAnsi="Cambria Math"/>
+                <w:sz w:val="22"/>
+              </w:rPr>
+              <m:t>,</m:t>
+            </m:r>
+            <m:r>
+              <w:rPr>
+                <w:rFonts w:ascii="Cambria Math" w:hAnsi="Cambria Math"/>
+                <w:sz w:val="22"/>
+              </w:rPr>
+              <m:t>K</m:t>
             </m:r>
           </m:sub>
         </m:sSub>
@@ -13653,7 +13915,49 @@
                 <w:rFonts w:ascii="Cambria Math" w:hAnsi="Cambria Math"/>
                 <w:sz w:val="22"/>
               </w:rPr>
-              <m:t>sel,u,p,K</m:t>
+              <m:t>sel</m:t>
+            </m:r>
+            <m:r>
+              <w:rPr>
+                <w:rFonts w:ascii="Cambria Math" w:hAnsi="Cambria Math"/>
+                <w:sz w:val="22"/>
+              </w:rPr>
+              <m:t>,</m:t>
+            </m:r>
+            <m:r>
+              <w:rPr>
+                <w:rFonts w:ascii="Cambria Math" w:hAnsi="Cambria Math"/>
+                <w:sz w:val="22"/>
+              </w:rPr>
+              <m:t>u</m:t>
+            </m:r>
+            <m:r>
+              <w:rPr>
+                <w:rFonts w:ascii="Cambria Math" w:hAnsi="Cambria Math"/>
+                <w:sz w:val="22"/>
+              </w:rPr>
+              <m:t>,</m:t>
+            </m:r>
+            <m:r>
+              <w:rPr>
+                <w:rFonts w:ascii="Cambria Math" w:hAnsi="Cambria Math"/>
+                <w:sz w:val="22"/>
+              </w:rPr>
+              <m:t>p</m:t>
+            </m:r>
+            <m:r>
+              <w:rPr>
+                <w:rFonts w:ascii="Cambria Math" w:hAnsi="Cambria Math"/>
+                <w:sz w:val="22"/>
+              </w:rPr>
+              <m:t>,</m:t>
+            </m:r>
+            <m:r>
+              <w:rPr>
+                <w:rFonts w:ascii="Cambria Math" w:hAnsi="Cambria Math"/>
+                <w:sz w:val="22"/>
+              </w:rPr>
+              <m:t>K</m:t>
             </m:r>
           </m:sub>
         </m:sSub>
@@ -13746,7 +14050,49 @@
                 <w:rFonts w:ascii="Cambria Math" w:hAnsi="Cambria Math"/>
                 <w:sz w:val="22"/>
               </w:rPr>
-              <m:t>sel,e,p,K</m:t>
+              <m:t>sel</m:t>
+            </m:r>
+            <m:r>
+              <w:rPr>
+                <w:rFonts w:ascii="Cambria Math" w:hAnsi="Cambria Math"/>
+                <w:sz w:val="22"/>
+              </w:rPr>
+              <m:t>,</m:t>
+            </m:r>
+            <m:r>
+              <w:rPr>
+                <w:rFonts w:ascii="Cambria Math" w:hAnsi="Cambria Math"/>
+                <w:sz w:val="22"/>
+              </w:rPr>
+              <m:t>e</m:t>
+            </m:r>
+            <m:r>
+              <w:rPr>
+                <w:rFonts w:ascii="Cambria Math" w:hAnsi="Cambria Math"/>
+                <w:sz w:val="22"/>
+              </w:rPr>
+              <m:t>,</m:t>
+            </m:r>
+            <m:r>
+              <w:rPr>
+                <w:rFonts w:ascii="Cambria Math" w:hAnsi="Cambria Math"/>
+                <w:sz w:val="22"/>
+              </w:rPr>
+              <m:t>p</m:t>
+            </m:r>
+            <m:r>
+              <w:rPr>
+                <w:rFonts w:ascii="Cambria Math" w:hAnsi="Cambria Math"/>
+                <w:sz w:val="22"/>
+              </w:rPr>
+              <m:t>,</m:t>
+            </m:r>
+            <m:r>
+              <w:rPr>
+                <w:rFonts w:ascii="Cambria Math" w:hAnsi="Cambria Math"/>
+                <w:sz w:val="22"/>
+              </w:rPr>
+              <m:t>K</m:t>
             </m:r>
           </m:sub>
         </m:sSub>
@@ -13805,7 +14151,63 @@
                             <w:rFonts w:ascii="Cambria Math" w:hAnsi="Cambria Math"/>
                             <w:sz w:val="22"/>
                           </w:rPr>
-                          <m:t>sel,s,f,p,K</m:t>
+                          <m:t>sel</m:t>
+                        </m:r>
+                        <m:r>
+                          <w:rPr>
+                            <w:rFonts w:ascii="Cambria Math" w:hAnsi="Cambria Math"/>
+                            <w:sz w:val="22"/>
+                          </w:rPr>
+                          <m:t>,</m:t>
+                        </m:r>
+                        <m:r>
+                          <w:rPr>
+                            <w:rFonts w:ascii="Cambria Math" w:hAnsi="Cambria Math"/>
+                            <w:sz w:val="22"/>
+                          </w:rPr>
+                          <m:t>s</m:t>
+                        </m:r>
+                        <m:r>
+                          <w:rPr>
+                            <w:rFonts w:ascii="Cambria Math" w:hAnsi="Cambria Math"/>
+                            <w:sz w:val="22"/>
+                          </w:rPr>
+                          <m:t>,</m:t>
+                        </m:r>
+                        <m:r>
+                          <w:rPr>
+                            <w:rFonts w:ascii="Cambria Math" w:hAnsi="Cambria Math"/>
+                            <w:sz w:val="22"/>
+                          </w:rPr>
+                          <m:t>f</m:t>
+                        </m:r>
+                        <m:r>
+                          <w:rPr>
+                            <w:rFonts w:ascii="Cambria Math" w:hAnsi="Cambria Math"/>
+                            <w:sz w:val="22"/>
+                          </w:rPr>
+                          <m:t>,</m:t>
+                        </m:r>
+                        <m:r>
+                          <w:rPr>
+                            <w:rFonts w:ascii="Cambria Math" w:hAnsi="Cambria Math"/>
+                            <w:sz w:val="22"/>
+                          </w:rPr>
+                          <m:t>p</m:t>
+                        </m:r>
+                        <m:r>
+                          <w:rPr>
+                            <w:rFonts w:ascii="Cambria Math" w:hAnsi="Cambria Math"/>
+                            <w:sz w:val="22"/>
+                          </w:rPr>
+                          <m:t>,</m:t>
+                        </m:r>
+                        <m:r>
+                          <w:rPr>
+                            <w:rFonts w:ascii="Cambria Math" w:hAnsi="Cambria Math"/>
+                            <w:sz w:val="22"/>
+                          </w:rPr>
+                          <m:t>K</m:t>
                         </m:r>
                       </m:sub>
                     </m:sSub>
@@ -13830,7 +14232,66 @@
                             <w:rFonts w:ascii="Cambria Math" w:hAnsi="Cambria Math"/>
                             <w:sz w:val="22"/>
                           </w:rPr>
-                          <m:t>best,s,f,hom,K</m:t>
+                          <m:t>best</m:t>
+                        </m:r>
+                        <m:r>
+                          <w:rPr>
+                            <w:rFonts w:ascii="Cambria Math" w:hAnsi="Cambria Math"/>
+                            <w:sz w:val="22"/>
+                          </w:rPr>
+                          <m:t>,</m:t>
+                        </m:r>
+                        <m:r>
+                          <w:rPr>
+                            <w:rFonts w:ascii="Cambria Math" w:hAnsi="Cambria Math"/>
+                            <w:sz w:val="22"/>
+                          </w:rPr>
+                          <m:t>s</m:t>
+                        </m:r>
+                        <m:r>
+                          <w:rPr>
+                            <w:rFonts w:ascii="Cambria Math" w:hAnsi="Cambria Math"/>
+                            <w:sz w:val="22"/>
+                          </w:rPr>
+                          <m:t>,</m:t>
+                        </m:r>
+                        <m:r>
+                          <w:rPr>
+                            <w:rFonts w:ascii="Cambria Math" w:hAnsi="Cambria Math"/>
+                            <w:sz w:val="22"/>
+                          </w:rPr>
+                          <m:t>f</m:t>
+                        </m:r>
+                        <m:r>
+                          <w:rPr>
+                            <w:rFonts w:ascii="Cambria Math" w:hAnsi="Cambria Math"/>
+                            <w:sz w:val="22"/>
+                          </w:rPr>
+                          <m:t>,</m:t>
+                        </m:r>
+                        <m:r>
+                          <m:rPr>
+                            <m:sty m:val="p"/>
+                          </m:rPr>
+                          <w:rPr>
+                            <w:rFonts w:ascii="Cambria Math" w:hAnsi="Cambria Math"/>
+                            <w:sz w:val="22"/>
+                          </w:rPr>
+                          <m:t>hom</m:t>
+                        </m:r>
+                        <m:r>
+                          <w:rPr>
+                            <w:rFonts w:ascii="Cambria Math" w:hAnsi="Cambria Math"/>
+                            <w:sz w:val="22"/>
+                          </w:rPr>
+                          <m:t>,</m:t>
+                        </m:r>
+                        <m:r>
+                          <w:rPr>
+                            <w:rFonts w:ascii="Cambria Math" w:hAnsi="Cambria Math"/>
+                            <w:sz w:val="22"/>
+                          </w:rPr>
+                          <m:t>K</m:t>
                         </m:r>
                       </m:sub>
                     </m:sSub>
@@ -13892,7 +14353,49 @@
                 <w:rFonts w:ascii="Cambria Math" w:hAnsi="Cambria Math"/>
                 <w:sz w:val="22"/>
               </w:rPr>
-              <m:t>rel,e,p,K</m:t>
+              <m:t>rel</m:t>
+            </m:r>
+            <m:r>
+              <w:rPr>
+                <w:rFonts w:ascii="Cambria Math" w:hAnsi="Cambria Math"/>
+                <w:sz w:val="22"/>
+              </w:rPr>
+              <m:t>,</m:t>
+            </m:r>
+            <m:r>
+              <w:rPr>
+                <w:rFonts w:ascii="Cambria Math" w:hAnsi="Cambria Math"/>
+                <w:sz w:val="22"/>
+              </w:rPr>
+              <m:t>e</m:t>
+            </m:r>
+            <m:r>
+              <w:rPr>
+                <w:rFonts w:ascii="Cambria Math" w:hAnsi="Cambria Math"/>
+                <w:sz w:val="22"/>
+              </w:rPr>
+              <m:t>,</m:t>
+            </m:r>
+            <m:r>
+              <w:rPr>
+                <w:rFonts w:ascii="Cambria Math" w:hAnsi="Cambria Math"/>
+                <w:sz w:val="22"/>
+              </w:rPr>
+              <m:t>p</m:t>
+            </m:r>
+            <m:r>
+              <w:rPr>
+                <w:rFonts w:ascii="Cambria Math" w:hAnsi="Cambria Math"/>
+                <w:sz w:val="22"/>
+              </w:rPr>
+              <m:t>,</m:t>
+            </m:r>
+            <m:r>
+              <w:rPr>
+                <w:rFonts w:ascii="Cambria Math" w:hAnsi="Cambria Math"/>
+                <w:sz w:val="22"/>
+              </w:rPr>
+              <m:t>K</m:t>
             </m:r>
           </m:sub>
         </m:sSub>
@@ -14021,7 +14524,49 @@
                 <w:rFonts w:ascii="Cambria Math" w:hAnsi="Cambria Math"/>
                 <w:sz w:val="22"/>
               </w:rPr>
-              <m:t>CF,e,p,K</m:t>
+              <m:t>CF</m:t>
+            </m:r>
+            <m:r>
+              <w:rPr>
+                <w:rFonts w:ascii="Cambria Math" w:hAnsi="Cambria Math"/>
+                <w:sz w:val="22"/>
+              </w:rPr>
+              <m:t>,</m:t>
+            </m:r>
+            <m:r>
+              <w:rPr>
+                <w:rFonts w:ascii="Cambria Math" w:hAnsi="Cambria Math"/>
+                <w:sz w:val="22"/>
+              </w:rPr>
+              <m:t>e</m:t>
+            </m:r>
+            <m:r>
+              <w:rPr>
+                <w:rFonts w:ascii="Cambria Math" w:hAnsi="Cambria Math"/>
+                <w:sz w:val="22"/>
+              </w:rPr>
+              <m:t>,</m:t>
+            </m:r>
+            <m:r>
+              <w:rPr>
+                <w:rFonts w:ascii="Cambria Math" w:hAnsi="Cambria Math"/>
+                <w:sz w:val="22"/>
+              </w:rPr>
+              <m:t>p</m:t>
+            </m:r>
+            <m:r>
+              <w:rPr>
+                <w:rFonts w:ascii="Cambria Math" w:hAnsi="Cambria Math"/>
+                <w:sz w:val="22"/>
+              </w:rPr>
+              <m:t>,</m:t>
+            </m:r>
+            <m:r>
+              <w:rPr>
+                <w:rFonts w:ascii="Cambria Math" w:hAnsi="Cambria Math"/>
+                <w:sz w:val="22"/>
+              </w:rPr>
+              <m:t>K</m:t>
             </m:r>
           </m:sub>
         </m:sSub>
@@ -14158,7 +14703,66 @@
                             <w:rFonts w:ascii="Cambria Math" w:hAnsi="Cambria Math"/>
                             <w:sz w:val="22"/>
                           </w:rPr>
-                          <m:t>best,s,f,hom,K</m:t>
+                          <m:t>best</m:t>
+                        </m:r>
+                        <m:r>
+                          <w:rPr>
+                            <w:rFonts w:ascii="Cambria Math" w:hAnsi="Cambria Math"/>
+                            <w:sz w:val="22"/>
+                          </w:rPr>
+                          <m:t>,</m:t>
+                        </m:r>
+                        <m:r>
+                          <w:rPr>
+                            <w:rFonts w:ascii="Cambria Math" w:hAnsi="Cambria Math"/>
+                            <w:sz w:val="22"/>
+                          </w:rPr>
+                          <m:t>s</m:t>
+                        </m:r>
+                        <m:r>
+                          <w:rPr>
+                            <w:rFonts w:ascii="Cambria Math" w:hAnsi="Cambria Math"/>
+                            <w:sz w:val="22"/>
+                          </w:rPr>
+                          <m:t>,</m:t>
+                        </m:r>
+                        <m:r>
+                          <w:rPr>
+                            <w:rFonts w:ascii="Cambria Math" w:hAnsi="Cambria Math"/>
+                            <w:sz w:val="22"/>
+                          </w:rPr>
+                          <m:t>f</m:t>
+                        </m:r>
+                        <m:r>
+                          <w:rPr>
+                            <w:rFonts w:ascii="Cambria Math" w:hAnsi="Cambria Math"/>
+                            <w:sz w:val="22"/>
+                          </w:rPr>
+                          <m:t>,</m:t>
+                        </m:r>
+                        <m:r>
+                          <m:rPr>
+                            <m:sty m:val="p"/>
+                          </m:rPr>
+                          <w:rPr>
+                            <w:rFonts w:ascii="Cambria Math" w:hAnsi="Cambria Math"/>
+                            <w:sz w:val="22"/>
+                          </w:rPr>
+                          <m:t>hom</m:t>
+                        </m:r>
+                        <m:r>
+                          <w:rPr>
+                            <w:rFonts w:ascii="Cambria Math" w:hAnsi="Cambria Math"/>
+                            <w:sz w:val="22"/>
+                          </w:rPr>
+                          <m:t>,</m:t>
+                        </m:r>
+                        <m:r>
+                          <w:rPr>
+                            <w:rFonts w:ascii="Cambria Math" w:hAnsi="Cambria Math"/>
+                            <w:sz w:val="22"/>
+                          </w:rPr>
+                          <m:t>K</m:t>
                         </m:r>
                       </m:sub>
                     </m:sSub>

</xml_diff>